<commit_message>
Reconcile full report draft to teammate S2 fuel-factory headline outputs
</commit_message>
<xml_diff>
--- a/reports/final/source/UCL-HTGR-Group3-Report-DRAFT_revised.docx
+++ b/reports/final/source/UCL-HTGR-Group3-Report-DRAFT_revised.docx
@@ -468,31 +468,66 @@
         <w:t xml:space="preserve"> </w:t>
       </w:r>
       <w:r>
-        <w:t xml:space="preserve">boundary. For this</w:t>
-      </w:r>
-      <w:r>
-        <w:t xml:space="preserve"> </w:t>
-      </w:r>
-      <w:r>
-        <w:t xml:space="preserve">validated baseline, the model converges to a feasible plant at 30.0</w:t>
-      </w:r>
-      <w:r>
-        <w:t xml:space="preserve"> </w:t>
-      </w:r>
-      <w:r>
-        <w:t xml:space="preserve">MWth with 9.939 MWe net output, 33.90% thermal efficiency, 33.13% net</w:t>
-      </w:r>
-      <w:r>
-        <w:t xml:space="preserve"> </w:t>
-      </w:r>
-      <w:r>
-        <w:t xml:space="preserve">efficiency, and 9,898 tCO2/year net reduction, corresponding to a</w:t>
-      </w:r>
-      <w:r>
-        <w:t xml:space="preserve"> </w:t>
-      </w:r>
-      <w:r>
-        <w:t xml:space="preserve">primary figure of merit of 329.9 tCO2/MWth/year.</w:t>
+        <w:t xml:space="preserve">boundary with</w:t>
+      </w:r>
+      <w:r>
+        <w:t xml:space="preserve"> </w:t>
+      </w:r>
+      <w:r>
+        <w:rPr>
+          <w:rStyle w:val="VerbatimChar"/>
+        </w:rPr>
+        <w:t xml:space="preserve">fuel_factory</w:t>
+      </w:r>
+      <w:r>
+        <w:t xml:space="preserve"> </w:t>
+      </w:r>
+      <w:r>
+        <w:t xml:space="preserve">concept mode. For this validated baseline, the model</w:t>
+      </w:r>
+      <w:r>
+        <w:t xml:space="preserve"> </w:t>
+      </w:r>
+      <w:r>
+        <w:t xml:space="preserve">converges to a feasible plant at 30.0 MWth with 9.628 MWe net output,</w:t>
+      </w:r>
+      <w:r>
+        <w:t xml:space="preserve"> </w:t>
+      </w:r>
+      <w:r>
+        <w:t xml:space="preserve">32.85% thermal efficiency, 32.09% net efficiency, and 30,364.1</w:t>
+      </w:r>
+      <w:r>
+        <w:t xml:space="preserve"> </w:t>
+      </w:r>
+      <w:r>
+        <w:t xml:space="preserve">tCO2/year net reduction, corresponding to a primary figure of merit of</w:t>
+      </w:r>
+      <w:r>
+        <w:t xml:space="preserve"> </w:t>
+      </w:r>
+      <w:r>
+        <w:t xml:space="preserve">1012.1 tCO2/MWth/year.</w:t>
+      </w:r>
+    </w:p>
+    <w:p>
+      <w:pPr>
+        <w:pStyle w:val="BodyText"/>
+      </w:pPr>
+      <w:r>
+        <w:t xml:space="preserve">This headline value is a project-level avoided-emissions Figure of Merit</w:t>
+      </w:r>
+      <w:r>
+        <w:t xml:space="preserve"> </w:t>
+      </w:r>
+      <w:r>
+        <w:t xml:space="preserve">under a fuel-displacement comparator boundary, not an audited corporate</w:t>
+      </w:r>
+      <w:r>
+        <w:t xml:space="preserve"> </w:t>
+      </w:r>
+      <w:r>
+        <w:t xml:space="preserve">GHG inventory claim.</w:t>
       </w:r>
     </w:p>
     <w:p>
@@ -1182,6 +1217,32 @@
         <w:t xml:space="preserve">low-value rejected heat into a productive CO2-reduction resource.</w:t>
       </w:r>
     </w:p>
+    <w:p>
+      <w:pPr>
+        <w:pStyle w:val="BodyText"/>
+      </w:pPr>
+      <w:r>
+        <w:t xml:space="preserve">For final headline scenarios, allocation is constrained in fuel-factory</w:t>
+      </w:r>
+      <w:r>
+        <w:t xml:space="preserve"> </w:t>
+      </w:r>
+      <w:r>
+        <w:t xml:space="preserve">mode with an enforced minimum methanol output floor, preventing the</w:t>
+      </w:r>
+      <w:r>
+        <w:t xml:space="preserve"> </w:t>
+      </w:r>
+      <w:r>
+        <w:t xml:space="preserve">solution from collapsing to DAC-only operation while still being</w:t>
+      </w:r>
+      <w:r>
+        <w:t xml:space="preserve"> </w:t>
+      </w:r>
+      <w:r>
+        <w:t xml:space="preserve">presented as integrated fuel production.</w:t>
+      </w:r>
+    </w:p>
     <w:bookmarkEnd w:id="57"/>
     <w:bookmarkStart w:id="65" w:name="Xd882f8ab9941309d112537bdcaaf396ea090435"/>
     <w:p>
@@ -1539,7 +1600,7 @@
         <w:rPr>
           <w:rStyle w:val="VerbatimChar"/>
         </w:rPr>
-        <w:t xml:space="preserve">Net_CO2_fuel_displacement = CO2_displaced_fossil - CO2_embodied = 9,898 tCO2/year</w:t>
+        <w:t xml:space="preserve">Net_CO2_fuel_displacement = CO2_displaced_fossil - CO2_embodied = 30,364.1 tCO2/year</w:t>
       </w:r>
     </w:p>
     <w:bookmarkEnd w:id="61"/>
@@ -1684,13 +1745,28 @@
         </w:numPr>
       </w:pPr>
       <w:r>
-        <w:t xml:space="preserve">kgCO2 and kgCO2e are treated as equivalent in this engineering-stage</w:t>
-      </w:r>
-      <w:r>
-        <w:t xml:space="preserve"> </w:t>
-      </w:r>
-      <w:r>
-        <w:t xml:space="preserve">accounting pass.</w:t>
+        <w:t xml:space="preserve">Headline optimization is run in</w:t>
+      </w:r>
+      <w:r>
+        <w:t xml:space="preserve"> </w:t>
+      </w:r>
+      <w:r>
+        <w:rPr>
+          <w:rStyle w:val="VerbatimChar"/>
+        </w:rPr>
+        <w:t xml:space="preserve">fuel_factory</w:t>
+      </w:r>
+      <w:r>
+        <w:t xml:space="preserve"> </w:t>
+      </w:r>
+      <w:r>
+        <w:t xml:space="preserve">concept mode with a</w:t>
+      </w:r>
+      <w:r>
+        <w:t xml:space="preserve"> </w:t>
+      </w:r>
+      <w:r>
+        <w:t xml:space="preserve">minimum methanol output floor enabled.</w:t>
       </w:r>
     </w:p>
     <w:p>
@@ -1702,7 +1778,43 @@
         </w:numPr>
       </w:pPr>
       <w:r>
+        <w:t xml:space="preserve">kgCO2 and kgCO2e are treated as equivalent in this engineering-stage</w:t>
+      </w:r>
+      <w:r>
+        <w:t xml:space="preserve"> </w:t>
+      </w:r>
+      <w:r>
+        <w:t xml:space="preserve">accounting pass.</w:t>
+      </w:r>
+    </w:p>
+    <w:p>
+      <w:pPr>
+        <w:pStyle w:val="Compact"/>
+        <w:numPr>
+          <w:ilvl w:val="0"/>
+          <w:numId w:val="1004"/>
+        </w:numPr>
+      </w:pPr>
+      <w:r>
         <w:t xml:space="preserve">No-grid-export policy is applied in the headline scenario.</w:t>
+      </w:r>
+    </w:p>
+    <w:p>
+      <w:pPr>
+        <w:pStyle w:val="Compact"/>
+        <w:numPr>
+          <w:ilvl w:val="0"/>
+          <w:numId w:val="1004"/>
+        </w:numPr>
+      </w:pPr>
+      <w:r>
+        <w:t xml:space="preserve">Headline CO2 claims are reported as project-level avoided-emissions</w:t>
+      </w:r>
+      <w:r>
+        <w:t xml:space="preserve"> </w:t>
+      </w:r>
+      <w:r>
+        <w:t xml:space="preserve">FoMs, not audited inventory claims.</w:t>
       </w:r>
     </w:p>
     <w:bookmarkEnd w:id="63"/>
@@ -1823,7 +1935,7 @@
         <w:t xml:space="preserve"> </w:t>
       </w:r>
       <w:r>
-        <w:t xml:space="preserve">The committed authoritative run reports 41.07% thermal efficiency</w:t>
+        <w:t xml:space="preserve">The committed authoritative run reports 41.10% thermal efficiency</w:t>
       </w:r>
       <w:r>
         <w:t xml:space="preserve"> </w:t>
@@ -1835,7 +1947,25 @@
         <w:t xml:space="preserve"> </w:t>
       </w:r>
       <w:r>
-        <w:t xml:space="preserve">passes.</w:t>
+        <w:t xml:space="preserve">passes. Additional validation anchors include secondary cycle sanity-band</w:t>
+      </w:r>
+      <w:r>
+        <w:t xml:space="preserve"> </w:t>
+      </w:r>
+      <w:r>
+        <w:t xml:space="preserve">checks, process-intensity closure checks (DAC/HTSE/methanol), and</w:t>
+      </w:r>
+      <w:r>
+        <w:t xml:space="preserve"> </w:t>
+      </w:r>
+      <w:r>
+        <w:t xml:space="preserve">boundary-consistency checks from identical plant states under alternative</w:t>
+      </w:r>
+      <w:r>
+        <w:t xml:space="preserve"> </w:t>
+      </w:r>
+      <w:r>
+        <w:t xml:space="preserve">accounting boundaries.</w:t>
       </w:r>
     </w:p>
     <w:bookmarkEnd w:id="67"/>
@@ -1887,6 +2017,24 @@
       </w:pPr>
       <w:r>
         <w:t xml:space="preserve">plant energy closure within tolerance,</w:t>
+      </w:r>
+    </w:p>
+    <w:p>
+      <w:pPr>
+        <w:pStyle w:val="Compact"/>
+        <w:numPr>
+          <w:ilvl w:val="0"/>
+          <w:numId w:val="1006"/>
+        </w:numPr>
+      </w:pPr>
+      <w:r>
+        <w:t xml:space="preserve">objective-consistency and methanol-floor policy checks passed for the</w:t>
+      </w:r>
+      <w:r>
+        <w:t xml:space="preserve"> </w:t>
+      </w:r>
+      <w:r>
+        <w:t xml:space="preserve">headline scenario,</w:t>
       </w:r>
     </w:p>
     <w:p>
@@ -2082,7 +2230,7 @@
               <w:jc w:val="right"/>
             </w:pPr>
             <w:r>
-              <w:t xml:space="preserve">9.939 MWe</w:t>
+              <w:t xml:space="preserve">9.628 MWe</w:t>
             </w:r>
           </w:p>
         </w:tc>
@@ -2107,7 +2255,7 @@
               <w:jc w:val="right"/>
             </w:pPr>
             <w:r>
-              <w:t xml:space="preserve">33.90%</w:t>
+              <w:t xml:space="preserve">32.85%</w:t>
             </w:r>
           </w:p>
         </w:tc>
@@ -2132,7 +2280,7 @@
               <w:jc w:val="right"/>
             </w:pPr>
             <w:r>
-              <w:t xml:space="preserve">33.13%</w:t>
+              <w:t xml:space="preserve">32.09%</w:t>
             </w:r>
           </w:p>
         </w:tc>
@@ -2157,7 +2305,7 @@
               <w:jc w:val="right"/>
             </w:pPr>
             <w:r>
-              <w:t xml:space="preserve">0.435%</w:t>
+              <w:t xml:space="preserve">0.377%</w:t>
             </w:r>
           </w:p>
         </w:tc>
@@ -2182,7 +2330,7 @@
               <w:jc w:val="right"/>
             </w:pPr>
             <w:r>
-              <w:t xml:space="preserve">165.9 kg/s</w:t>
+              <w:t xml:space="preserve">162.5 kg/s</w:t>
             </w:r>
           </w:p>
         </w:tc>
@@ -2232,7 +2380,7 @@
               <w:jc w:val="right"/>
             </w:pPr>
             <w:r>
-              <w:t xml:space="preserve">517.7 C</w:t>
+              <w:t xml:space="preserve">520.0 C</w:t>
             </w:r>
           </w:p>
         </w:tc>
@@ -2257,7 +2405,7 @@
               <w:jc w:val="right"/>
             </w:pPr>
             <w:r>
-              <w:t xml:space="preserve">+1.66 K</w:t>
+              <w:t xml:space="preserve">+0.98 K</w:t>
             </w:r>
           </w:p>
         </w:tc>
@@ -2282,7 +2430,7 @@
               <w:jc w:val="right"/>
             </w:pPr>
             <w:r>
-              <w:t xml:space="preserve">+13.00 K</w:t>
+              <w:t xml:space="preserve">+13.37 K</w:t>
             </w:r>
           </w:p>
         </w:tc>
@@ -2307,7 +2455,7 @@
               <w:jc w:val="right"/>
             </w:pPr>
             <w:r>
-              <w:t xml:space="preserve">+2.82 K</w:t>
+              <w:t xml:space="preserve">+3.02 K</w:t>
             </w:r>
           </w:p>
         </w:tc>
@@ -2332,7 +2480,7 @@
               <w:jc w:val="right"/>
             </w:pPr>
             <w:r>
-              <w:t xml:space="preserve">+10.74 K</w:t>
+              <w:t xml:space="preserve">+0.92 K</w:t>
             </w:r>
           </w:p>
         </w:tc>
@@ -2453,7 +2601,7 @@
               <w:jc w:val="right"/>
             </w:pPr>
             <w:r>
-              <w:t xml:space="preserve">9,898 tCO2/year</w:t>
+              <w:t xml:space="preserve">30,364.1 tCO2/year</w:t>
             </w:r>
           </w:p>
         </w:tc>
@@ -2478,7 +2626,7 @@
               <w:jc w:val="right"/>
             </w:pPr>
             <w:r>
-              <w:t xml:space="preserve">329.9 tCO2/MWth/year</w:t>
+              <w:t xml:space="preserve">1012.1 tCO2/MWth/year</w:t>
             </w:r>
           </w:p>
         </w:tc>
@@ -2503,7 +2651,7 @@
               <w:jc w:val="right"/>
             </w:pPr>
             <w:r>
-              <w:t xml:space="preserve">44,468 tCO2/year</w:t>
+              <w:t xml:space="preserve">15,192.4 tCO2/year</w:t>
             </w:r>
           </w:p>
         </w:tc>
@@ -2528,7 +2676,7 @@
               <w:jc w:val="right"/>
             </w:pPr>
             <w:r>
-              <w:t xml:space="preserve">627.3 t/year</w:t>
+              <w:t xml:space="preserve">1,924.4 t/year</w:t>
             </w:r>
           </w:p>
         </w:tc>
@@ -2553,7 +2701,7 @@
               <w:jc w:val="right"/>
             </w:pPr>
             <w:r>
-              <w:t xml:space="preserve">3245.3 t/year</w:t>
+              <w:t xml:space="preserve">9,955.4 t/year</w:t>
             </w:r>
           </w:p>
         </w:tc>
@@ -2614,19 +2762,19 @@
         <w:pStyle w:val="BodyText"/>
       </w:pPr>
       <w:r>
-        <w:t xml:space="preserve">Uncertainty context from the committed canonical UQ artifact (120</w:t>
-      </w:r>
-      <w:r>
-        <w:t xml:space="preserve"> </w:t>
-      </w:r>
-      <w:r>
-        <w:t xml:space="preserve">samples): FoM mean 331.6 tCO2/MWth/year, p10/p50/p90 of 302.7 / 331.5 /</w:t>
-      </w:r>
-      <w:r>
-        <w:t xml:space="preserve"> </w:t>
-      </w:r>
-      <w:r>
-        <w:t xml:space="preserve">360.8, and a 95% interval of 288.6 to 377.9 tCO2/MWth/year.</w:t>
+        <w:t xml:space="preserve">Uncertainty context from the committed canonical UQ artifact (40</w:t>
+      </w:r>
+      <w:r>
+        <w:t xml:space="preserve"> </w:t>
+      </w:r>
+      <w:r>
+        <w:t xml:space="preserve">samples): FoM mean 1004.9 tCO2/MWth/year, p10/p50/p90 of 892.2 / 1007.9</w:t>
+      </w:r>
+      <w:r>
+        <w:t xml:space="preserve"> </w:t>
+      </w:r>
+      <w:r>
+        <w:t xml:space="preserve">/ 1220.1, and a 95% interval of 690.2 to 1238.5 tCO2/MWth/year.</w:t>
       </w:r>
     </w:p>
     <w:bookmarkEnd w:id="71"/>
@@ -2730,18 +2878,18 @@
               <w:pStyle w:val="Compact"/>
             </w:pPr>
             <w:r>
-              <w:t xml:space="preserve">S0_BASE_30MW_OPONLY</w:t>
-            </w:r>
-          </w:p>
-        </w:tc>
-        <w:tc>
-          <w:tcPr/>
-          <w:p>
-            <w:pPr>
-              <w:pStyle w:val="Compact"/>
-            </w:pPr>
-            <w:r>
-              <w:t xml:space="preserve">30 MWth, operational_only</w:t>
+              <w:t xml:space="preserve">S2_30MW_FUELDISP</w:t>
+            </w:r>
+          </w:p>
+        </w:tc>
+        <w:tc>
+          <w:tcPr/>
+          <w:p>
+            <w:pPr>
+              <w:pStyle w:val="Compact"/>
+            </w:pPr>
+            <w:r>
+              <w:t xml:space="preserve">30 MWth, fuel_displacement (headline)</w:t>
             </w:r>
           </w:p>
         </w:tc>
@@ -2753,7 +2901,7 @@
               <w:jc w:val="right"/>
             </w:pPr>
             <w:r>
-              <w:t xml:space="preserve">9.939</w:t>
+              <w:t xml:space="preserve">9.628</w:t>
             </w:r>
           </w:p>
         </w:tc>
@@ -2765,7 +2913,7 @@
               <w:jc w:val="right"/>
             </w:pPr>
             <w:r>
-              <w:t xml:space="preserve">1482.3</w:t>
+              <w:t xml:space="preserve">1012.1</w:t>
             </w:r>
           </w:p>
         </w:tc>
@@ -2789,18 +2937,18 @@
               <w:pStyle w:val="Compact"/>
             </w:pPr>
             <w:r>
-              <w:t xml:space="preserve">S1_36MW_OPONLY</w:t>
-            </w:r>
-          </w:p>
-        </w:tc>
-        <w:tc>
-          <w:tcPr/>
-          <w:p>
-            <w:pPr>
-              <w:pStyle w:val="Compact"/>
-            </w:pPr>
-            <w:r>
-              <w:t xml:space="preserve">36 MWth, operational_only</w:t>
+              <w:t xml:space="preserve">S3_36MW_FUELDISP</w:t>
+            </w:r>
+          </w:p>
+        </w:tc>
+        <w:tc>
+          <w:tcPr/>
+          <w:p>
+            <w:pPr>
+              <w:pStyle w:val="Compact"/>
+            </w:pPr>
+            <w:r>
+              <w:t xml:space="preserve">36 MWth, fuel_displacement</w:t>
             </w:r>
           </w:p>
         </w:tc>
@@ -2812,7 +2960,7 @@
               <w:jc w:val="right"/>
             </w:pPr>
             <w:r>
-              <w:t xml:space="preserve">12.101</w:t>
+              <w:t xml:space="preserve">11.464</w:t>
             </w:r>
           </w:p>
         </w:tc>
@@ -2824,7 +2972,7 @@
               <w:jc w:val="right"/>
             </w:pPr>
             <w:r>
-              <w:t xml:space="preserve">1471.9</w:t>
+              <w:t xml:space="preserve">1004.3</w:t>
             </w:r>
           </w:p>
         </w:tc>
@@ -2848,18 +2996,18 @@
               <w:pStyle w:val="Compact"/>
             </w:pPr>
             <w:r>
-              <w:t xml:space="preserve">S2_30MW_FUELDISP</w:t>
-            </w:r>
-          </w:p>
-        </w:tc>
-        <w:tc>
-          <w:tcPr/>
-          <w:p>
-            <w:pPr>
-              <w:pStyle w:val="Compact"/>
-            </w:pPr>
-            <w:r>
-              <w:t xml:space="preserve">30 MWth, fuel_displacement (headline)</w:t>
+              <w:t xml:space="preserve">S0_BASE_30MW_OPONLY</w:t>
+            </w:r>
+          </w:p>
+        </w:tc>
+        <w:tc>
+          <w:tcPr/>
+          <w:p>
+            <w:pPr>
+              <w:pStyle w:val="Compact"/>
+            </w:pPr>
+            <w:r>
+              <w:t xml:space="preserve">30 MWth, operational_only</w:t>
             </w:r>
           </w:p>
         </w:tc>
@@ -2871,7 +3019,7 @@
               <w:jc w:val="right"/>
             </w:pPr>
             <w:r>
-              <w:t xml:space="preserve">9.939</w:t>
+              <w:t xml:space="preserve">9.628</w:t>
             </w:r>
           </w:p>
         </w:tc>
@@ -2883,7 +3031,7 @@
               <w:jc w:val="right"/>
             </w:pPr>
             <w:r>
-              <w:t xml:space="preserve">329.9</w:t>
+              <w:t xml:space="preserve">3014.8</w:t>
             </w:r>
           </w:p>
         </w:tc>
@@ -2907,18 +3055,18 @@
               <w:pStyle w:val="Compact"/>
             </w:pPr>
             <w:r>
-              <w:t xml:space="preserve">S3_36MW_FUELDISP</w:t>
-            </w:r>
-          </w:p>
-        </w:tc>
-        <w:tc>
-          <w:tcPr/>
-          <w:p>
-            <w:pPr>
-              <w:pStyle w:val="Compact"/>
-            </w:pPr>
-            <w:r>
-              <w:t xml:space="preserve">36 MWth, fuel_displacement</w:t>
+              <w:t xml:space="preserve">S1_36MW_OPONLY</w:t>
+            </w:r>
+          </w:p>
+        </w:tc>
+        <w:tc>
+          <w:tcPr/>
+          <w:p>
+            <w:pPr>
+              <w:pStyle w:val="Compact"/>
+            </w:pPr>
+            <w:r>
+              <w:t xml:space="preserve">36 MWth, operational_only</w:t>
             </w:r>
           </w:p>
         </w:tc>
@@ -2930,7 +3078,7 @@
               <w:jc w:val="right"/>
             </w:pPr>
             <w:r>
-              <w:t xml:space="preserve">12.101</w:t>
+              <w:t xml:space="preserve">11.464</w:t>
             </w:r>
           </w:p>
         </w:tc>
@@ -2942,7 +3090,7 @@
               <w:jc w:val="right"/>
             </w:pPr>
             <w:r>
-              <w:t xml:space="preserve">334.7</w:t>
+              <w:t xml:space="preserve">3025.6</w:t>
             </w:r>
           </w:p>
         </w:tc>
@@ -3009,6 +3157,24 @@
         <w:t xml:space="preserve">claims in the main report.</w:t>
       </w:r>
     </w:p>
+    <w:p>
+      <w:pPr>
+        <w:pStyle w:val="Compact"/>
+        <w:numPr>
+          <w:ilvl w:val="0"/>
+          <w:numId w:val="1007"/>
+        </w:numPr>
+      </w:pPr>
+      <w:r>
+        <w:t xml:space="preserve">Boundary mode strongly affects FoM magnitude and interpretation, so</w:t>
+      </w:r>
+      <w:r>
+        <w:t xml:space="preserve"> </w:t>
+      </w:r>
+      <w:r>
+        <w:t xml:space="preserve">scenario tags and boundary labels are required on all reported values.</w:t>
+      </w:r>
+    </w:p>
     <w:bookmarkEnd w:id="72"/>
     <w:bookmarkEnd w:id="73"/>
     <w:bookmarkStart w:id="81" w:name="section-7---safety-philosophy"/>
@@ -4184,7 +4350,13 @@
         <w:t xml:space="preserve">fuel_displacement</w:t>
       </w:r>
       <w:r>
-        <w:t xml:space="preserve">).</w:t>
+        <w:t xml:space="preserve">) and an allocation</w:t>
+      </w:r>
+      <w:r>
+        <w:t xml:space="preserve"> </w:t>
+      </w:r>
+      <w:r>
+        <w:t xml:space="preserve">policy that enforces fuel-factory behavior.</w:t>
       </w:r>
     </w:p>
     <w:bookmarkEnd w:id="86"/>
@@ -4267,7 +4439,321 @@
     </w:p>
     <w:bookmarkEnd w:id="87"/>
     <w:bookmarkEnd w:id="88"/>
-    <w:bookmarkStart w:id="100" w:name="references"/>
+    <w:bookmarkStart w:id="89" w:name="Xb1723ff1399b8265b6f5fc1b051c0c9bdba6705"/>
+    <w:p>
+      <w:pPr>
+        <w:pStyle w:val="Heading1"/>
+      </w:pPr>
+      <w:r>
+        <w:t xml:space="preserve">Assumptions and Limitations (Main-Body Summary)</w:t>
+      </w:r>
+    </w:p>
+    <w:tbl>
+      <w:tblPr>
+        <w:tblStyle w:val="Table"/>
+        <w:tblW w:type="auto" w:w="0"/>
+        <w:tblLook w:firstRow="1" w:lastRow="0" w:firstColumn="0" w:lastColumn="0" w:noHBand="0" w:noVBand="0" w:val="0020"/>
+      </w:tblPr>
+      <w:tblGrid>
+        <w:gridCol w:w="1980"/>
+        <w:gridCol w:w="1980"/>
+        <w:gridCol w:w="1980"/>
+        <w:gridCol w:w="1980"/>
+      </w:tblGrid>
+      <w:tr>
+        <w:trPr>
+          <w:tblHeader w:val="on"/>
+        </w:trPr>
+        <w:tc>
+          <w:tcPr/>
+          <w:p>
+            <w:pPr>
+              <w:pStyle w:val="Compact"/>
+            </w:pPr>
+            <w:r>
+              <w:t xml:space="preserve">Item</w:t>
+            </w:r>
+          </w:p>
+        </w:tc>
+        <w:tc>
+          <w:tcPr/>
+          <w:p>
+            <w:pPr>
+              <w:pStyle w:val="Compact"/>
+            </w:pPr>
+            <w:r>
+              <w:t xml:space="preserve">Current treatment</w:t>
+            </w:r>
+          </w:p>
+        </w:tc>
+        <w:tc>
+          <w:tcPr/>
+          <w:p>
+            <w:pPr>
+              <w:pStyle w:val="Compact"/>
+            </w:pPr>
+            <w:r>
+              <w:t xml:space="preserve">Why acceptable now</w:t>
+            </w:r>
+          </w:p>
+        </w:tc>
+        <w:tc>
+          <w:tcPr/>
+          <w:p>
+            <w:pPr>
+              <w:pStyle w:val="Compact"/>
+            </w:pPr>
+            <w:r>
+              <w:t xml:space="preserve">Next-step upgrade</w:t>
+            </w:r>
+          </w:p>
+        </w:tc>
+      </w:tr>
+      <w:tr>
+        <w:tc>
+          <w:tcPr/>
+          <w:p>
+            <w:pPr>
+              <w:pStyle w:val="Compact"/>
+            </w:pPr>
+            <w:r>
+              <w:t xml:space="preserve">Headline accounting boundary</w:t>
+            </w:r>
+          </w:p>
+        </w:tc>
+        <w:tc>
+          <w:tcPr/>
+          <w:p>
+            <w:pPr>
+              <w:pStyle w:val="Compact"/>
+            </w:pPr>
+            <w:r>
+              <w:rPr>
+                <w:rStyle w:val="VerbatimChar"/>
+              </w:rPr>
+              <w:t xml:space="preserve">fuel_displacement</w:t>
+            </w:r>
+            <w:r>
+              <w:t xml:space="preserve"> </w:t>
+            </w:r>
+            <w:r>
+              <w:t xml:space="preserve">project FoM</w:t>
+            </w:r>
+          </w:p>
+        </w:tc>
+        <w:tc>
+          <w:tcPr/>
+          <w:p>
+            <w:pPr>
+              <w:pStyle w:val="Compact"/>
+            </w:pPr>
+            <w:r>
+              <w:t xml:space="preserve">Aligns with fuel-factory concept and is explicitly labeled</w:t>
+            </w:r>
+          </w:p>
+        </w:tc>
+        <w:tc>
+          <w:tcPr/>
+          <w:p>
+            <w:pPr>
+              <w:pStyle w:val="Compact"/>
+            </w:pPr>
+            <w:r>
+              <w:t xml:space="preserve">Add RR-specified boundary preference if provided</w:t>
+            </w:r>
+          </w:p>
+        </w:tc>
+      </w:tr>
+      <w:tr>
+        <w:tc>
+          <w:tcPr/>
+          <w:p>
+            <w:pPr>
+              <w:pStyle w:val="Compact"/>
+            </w:pPr>
+            <w:r>
+              <w:t xml:space="preserve">Cooling representation in headline</w:t>
+            </w:r>
+          </w:p>
+        </w:tc>
+        <w:tc>
+          <w:tcPr/>
+          <w:p>
+            <w:pPr>
+              <w:pStyle w:val="Compact"/>
+            </w:pPr>
+            <w:r>
+              <w:rPr>
+                <w:rStyle w:val="VerbatimChar"/>
+              </w:rPr>
+              <w:t xml:space="preserve">fixed_boundary</w:t>
+            </w:r>
+          </w:p>
+        </w:tc>
+        <w:tc>
+          <w:tcPr/>
+          <w:p>
+            <w:pPr>
+              <w:pStyle w:val="Compact"/>
+            </w:pPr>
+            <w:r>
+              <w:t xml:space="preserve">HTGR-only scope, thermodynamic closure maintained</w:t>
+            </w:r>
+          </w:p>
+        </w:tc>
+        <w:tc>
+          <w:tcPr/>
+          <w:p>
+            <w:pPr>
+              <w:pStyle w:val="Compact"/>
+            </w:pPr>
+            <w:r>
+              <w:t xml:space="preserve">Improve coupled cooling fidelity in sensitivity appendix</w:t>
+            </w:r>
+          </w:p>
+        </w:tc>
+      </w:tr>
+      <w:tr>
+        <w:tc>
+          <w:tcPr/>
+          <w:p>
+            <w:pPr>
+              <w:pStyle w:val="Compact"/>
+            </w:pPr>
+            <w:r>
+              <w:t xml:space="preserve">Reactor-side fidelity</w:t>
+            </w:r>
+          </w:p>
+        </w:tc>
+        <w:tc>
+          <w:tcPr/>
+          <w:p>
+            <w:pPr>
+              <w:pStyle w:val="Compact"/>
+            </w:pPr>
+            <w:r>
+              <w:t xml:space="preserve">Boundary-condition thermal source</w:t>
+            </w:r>
+          </w:p>
+        </w:tc>
+        <w:tc>
+          <w:tcPr/>
+          <w:p>
+            <w:pPr>
+              <w:pStyle w:val="Compact"/>
+            </w:pPr>
+            <w:r>
+              <w:t xml:space="preserve">Appropriate for this cycle scope</w:t>
+            </w:r>
+          </w:p>
+        </w:tc>
+        <w:tc>
+          <w:tcPr/>
+          <w:p>
+            <w:pPr>
+              <w:pStyle w:val="Compact"/>
+            </w:pPr>
+            <w:r>
+              <w:t xml:space="preserve">Add higher-fidelity reactor-side coupling</w:t>
+            </w:r>
+          </w:p>
+        </w:tc>
+      </w:tr>
+      <w:tr>
+        <w:tc>
+          <w:tcPr/>
+          <w:p>
+            <w:pPr>
+              <w:pStyle w:val="Compact"/>
+            </w:pPr>
+            <w:r>
+              <w:t xml:space="preserve">UQ depth</w:t>
+            </w:r>
+          </w:p>
+        </w:tc>
+        <w:tc>
+          <w:tcPr/>
+          <w:p>
+            <w:pPr>
+              <w:pStyle w:val="Compact"/>
+            </w:pPr>
+            <w:r>
+              <w:t xml:space="preserve">Seeded 40-sample campaign</w:t>
+            </w:r>
+          </w:p>
+        </w:tc>
+        <w:tc>
+          <w:tcPr/>
+          <w:p>
+            <w:pPr>
+              <w:pStyle w:val="Compact"/>
+            </w:pPr>
+            <w:r>
+              <w:t xml:space="preserve">Reproducible and schedule-compatible</w:t>
+            </w:r>
+          </w:p>
+        </w:tc>
+        <w:tc>
+          <w:tcPr/>
+          <w:p>
+            <w:pPr>
+              <w:pStyle w:val="Compact"/>
+            </w:pPr>
+            <w:r>
+              <w:t xml:space="preserve">Expand sample size and input uncertainty space</w:t>
+            </w:r>
+          </w:p>
+        </w:tc>
+      </w:tr>
+      <w:tr>
+        <w:tc>
+          <w:tcPr/>
+          <w:p>
+            <w:pPr>
+              <w:pStyle w:val="Compact"/>
+            </w:pPr>
+            <w:r>
+              <w:t xml:space="preserve">Safety integration</w:t>
+            </w:r>
+          </w:p>
+        </w:tc>
+        <w:tc>
+          <w:tcPr/>
+          <w:p>
+            <w:pPr>
+              <w:pStyle w:val="Compact"/>
+            </w:pPr>
+            <w:r>
+              <w:t xml:space="preserve">External workstream evidence</w:t>
+            </w:r>
+          </w:p>
+        </w:tc>
+        <w:tc>
+          <w:tcPr/>
+          <w:p>
+            <w:pPr>
+              <w:pStyle w:val="Compact"/>
+            </w:pPr>
+            <w:r>
+              <w:t xml:space="preserve">Preserves traceability and avoids overclaiming integration</w:t>
+            </w:r>
+          </w:p>
+        </w:tc>
+        <w:tc>
+          <w:tcPr/>
+          <w:p>
+            <w:pPr>
+              <w:pStyle w:val="Compact"/>
+            </w:pPr>
+            <w:r>
+              <w:t xml:space="preserve">Add tighter coupling path in future stage</w:t>
+            </w:r>
+          </w:p>
+        </w:tc>
+      </w:tr>
+    </w:tbl>
+    <w:bookmarkEnd w:id="89"/>
+    <w:bookmarkStart w:id="101" w:name="references"/>
     <w:p>
       <w:pPr>
         <w:pStyle w:val="Heading1"/>
@@ -4338,7 +4824,7 @@
       <w:r>
         <w:t xml:space="preserve"> </w:t>
       </w:r>
-      <w:hyperlink r:id="rId89">
+      <w:hyperlink r:id="rId90">
         <w:r>
           <w:rPr>
             <w:rStyle w:val="Hyperlink"/>
@@ -4385,8 +4871,8 @@
       <w:r>
         <w:t xml:space="preserve"> </w:t>
       </w:r>
-      <w:hyperlink r:id="rId90">
-        <w:hyperlink r:id="rId90">
+      <w:hyperlink r:id="rId91">
+        <w:hyperlink r:id="rId91">
           <w:r>
             <w:rPr>
               <w:rStyle w:val="Hyperlink"/>
@@ -4450,8 +4936,8 @@
       <w:r>
         <w:t xml:space="preserve"> </w:t>
       </w:r>
-      <w:hyperlink r:id="rId91">
-        <w:hyperlink r:id="rId91">
+      <w:hyperlink r:id="rId92">
+        <w:hyperlink r:id="rId92">
           <w:r>
             <w:rPr>
               <w:rStyle w:val="Hyperlink"/>
@@ -4483,8 +4969,8 @@
       <w:r>
         <w:t xml:space="preserve"> </w:t>
       </w:r>
-      <w:hyperlink r:id="rId92">
-        <w:hyperlink r:id="rId92">
+      <w:hyperlink r:id="rId93">
+        <w:hyperlink r:id="rId93">
           <w:r>
             <w:rPr>
               <w:rStyle w:val="Hyperlink"/>
@@ -4544,8 +5030,8 @@
       <w:r>
         <w:t xml:space="preserve"> </w:t>
       </w:r>
-      <w:hyperlink r:id="rId93">
-        <w:hyperlink r:id="rId93">
+      <w:hyperlink r:id="rId94">
+        <w:hyperlink r:id="rId94">
           <w:r>
             <w:rPr>
               <w:rStyle w:val="Hyperlink"/>
@@ -4598,8 +5084,8 @@
       <w:r>
         <w:t xml:space="preserve"> </w:t>
       </w:r>
-      <w:hyperlink r:id="rId94">
-        <w:hyperlink r:id="rId94">
+      <w:hyperlink r:id="rId95">
+        <w:hyperlink r:id="rId95">
           <w:r>
             <w:rPr>
               <w:rStyle w:val="Hyperlink"/>
@@ -4646,8 +5132,8 @@
       <w:r>
         <w:t xml:space="preserve"> </w:t>
       </w:r>
-      <w:hyperlink r:id="rId95">
-        <w:hyperlink r:id="rId95">
+      <w:hyperlink r:id="rId96">
+        <w:hyperlink r:id="rId96">
           <w:r>
             <w:rPr>
               <w:rStyle w:val="Hyperlink"/>
@@ -4719,8 +5205,8 @@
       <w:r>
         <w:t xml:space="preserve"> </w:t>
       </w:r>
-      <w:hyperlink r:id="rId96">
-        <w:hyperlink r:id="rId96">
+      <w:hyperlink r:id="rId97">
+        <w:hyperlink r:id="rId97">
           <w:r>
             <w:rPr>
               <w:rStyle w:val="Hyperlink"/>
@@ -4767,8 +5253,8 @@
       <w:r>
         <w:t xml:space="preserve"> </w:t>
       </w:r>
-      <w:hyperlink r:id="rId97">
-        <w:hyperlink r:id="rId97">
+      <w:hyperlink r:id="rId98">
+        <w:hyperlink r:id="rId98">
           <w:r>
             <w:rPr>
               <w:rStyle w:val="Hyperlink"/>
@@ -4815,8 +5301,8 @@
       <w:r>
         <w:t xml:space="preserve"> </w:t>
       </w:r>
-      <w:hyperlink r:id="rId98">
-        <w:hyperlink r:id="rId98">
+      <w:hyperlink r:id="rId99">
+        <w:hyperlink r:id="rId99">
           <w:r>
             <w:rPr>
               <w:rStyle w:val="Hyperlink"/>
@@ -4855,8 +5341,8 @@
       <w:r>
         <w:t xml:space="preserve"> </w:t>
       </w:r>
-      <w:hyperlink r:id="rId99">
-        <w:hyperlink r:id="rId99">
+      <w:hyperlink r:id="rId100">
+        <w:hyperlink r:id="rId100">
           <w:r>
             <w:rPr>
               <w:rStyle w:val="Hyperlink"/>
@@ -4866,8 +5352,8 @@
         </w:hyperlink>
       </w:hyperlink>
     </w:p>
-    <w:bookmarkEnd w:id="100"/>
-    <w:bookmarkStart w:id="103" w:name="appendix"/>
+    <w:bookmarkEnd w:id="101"/>
+    <w:bookmarkStart w:id="104" w:name="appendix"/>
     <w:p>
       <w:pPr>
         <w:pStyle w:val="Heading1"/>
@@ -4876,7 +5362,7 @@
         <w:t xml:space="preserve">Appendix</w:t>
       </w:r>
     </w:p>
-    <w:bookmarkStart w:id="102" w:name="X5e25010629b4cdabbc91bd592947126bec75267"/>
+    <w:bookmarkStart w:id="103" w:name="X5e25010629b4cdabbc91bd592947126bec75267"/>
     <w:p>
       <w:pPr>
         <w:pStyle w:val="Heading2"/>
@@ -5088,7 +5574,7 @@
         <w:t xml:space="preserve">Table 4.3: Input parameters and numerical substitutions</w:t>
       </w:r>
     </w:p>
-    <w:bookmarkStart w:id="101" w:name="derivation-of-nuclear-heat-ef"/>
+    <w:bookmarkStart w:id="102" w:name="derivation-of-nuclear-heat-ef"/>
     <w:p>
       <w:pPr>
         <w:pStyle w:val="Heading4"/>
@@ -5120,9 +5606,9 @@
         <w:pStyle w:val="BodyText"/>
       </w:pPr>
     </w:p>
-    <w:bookmarkEnd w:id="101"/>
     <w:bookmarkEnd w:id="102"/>
     <w:bookmarkEnd w:id="103"/>
+    <w:bookmarkEnd w:id="104"/>
     <w:sectPr>
       <w:pgSz w:h="16834" w:orient="portrait" w:w="11909"/>
       <w:pgMar w:bottom="1440" w:footer="720" w:header="720" w:left="1440" w:right="1440" w:top="1440"/>
@@ -6034,6 +6520,232 @@
     <w:pPr>
       <w:wordWrap w:val="off"/>
     </w:pPr>
+  </w:style>
+  <w:style w:customStyle="1" w:styleId="KeywordTok" w:type="character">
+    <w:name w:val="KeywordTok"/>
+    <w:basedOn w:val="VerbatimChar"/>
+    <w:rPr>
+      <w:b/>
+      <w:color w:val="007020"/>
+    </w:rPr>
+  </w:style>
+  <w:style w:customStyle="1" w:styleId="DataTypeTok" w:type="character">
+    <w:name w:val="DataTypeTok"/>
+    <w:basedOn w:val="VerbatimChar"/>
+    <w:rPr>
+      <w:color w:val="902000"/>
+    </w:rPr>
+  </w:style>
+  <w:style w:customStyle="1" w:styleId="DecValTok" w:type="character">
+    <w:name w:val="DecValTok"/>
+    <w:basedOn w:val="VerbatimChar"/>
+    <w:rPr>
+      <w:color w:val="40a070"/>
+    </w:rPr>
+  </w:style>
+  <w:style w:customStyle="1" w:styleId="BaseNTok" w:type="character">
+    <w:name w:val="BaseNTok"/>
+    <w:basedOn w:val="VerbatimChar"/>
+    <w:rPr>
+      <w:color w:val="40a070"/>
+    </w:rPr>
+  </w:style>
+  <w:style w:customStyle="1" w:styleId="FloatTok" w:type="character">
+    <w:name w:val="FloatTok"/>
+    <w:basedOn w:val="VerbatimChar"/>
+    <w:rPr>
+      <w:color w:val="40a070"/>
+    </w:rPr>
+  </w:style>
+  <w:style w:customStyle="1" w:styleId="ConstantTok" w:type="character">
+    <w:name w:val="ConstantTok"/>
+    <w:basedOn w:val="VerbatimChar"/>
+    <w:rPr>
+      <w:color w:val="880000"/>
+    </w:rPr>
+  </w:style>
+  <w:style w:customStyle="1" w:styleId="CharTok" w:type="character">
+    <w:name w:val="CharTok"/>
+    <w:basedOn w:val="VerbatimChar"/>
+    <w:rPr>
+      <w:color w:val="4070a0"/>
+    </w:rPr>
+  </w:style>
+  <w:style w:customStyle="1" w:styleId="SpecialCharTok" w:type="character">
+    <w:name w:val="SpecialCharTok"/>
+    <w:basedOn w:val="VerbatimChar"/>
+    <w:rPr>
+      <w:color w:val="4070a0"/>
+    </w:rPr>
+  </w:style>
+  <w:style w:customStyle="1" w:styleId="StringTok" w:type="character">
+    <w:name w:val="StringTok"/>
+    <w:basedOn w:val="VerbatimChar"/>
+    <w:rPr>
+      <w:color w:val="4070a0"/>
+    </w:rPr>
+  </w:style>
+  <w:style w:customStyle="1" w:styleId="VerbatimStringTok" w:type="character">
+    <w:name w:val="VerbatimStringTok"/>
+    <w:basedOn w:val="VerbatimChar"/>
+    <w:rPr>
+      <w:color w:val="4070a0"/>
+    </w:rPr>
+  </w:style>
+  <w:style w:customStyle="1" w:styleId="SpecialStringTok" w:type="character">
+    <w:name w:val="SpecialStringTok"/>
+    <w:basedOn w:val="VerbatimChar"/>
+    <w:rPr>
+      <w:color w:val="bb6688"/>
+    </w:rPr>
+  </w:style>
+  <w:style w:customStyle="1" w:styleId="ImportTok" w:type="character">
+    <w:name w:val="ImportTok"/>
+    <w:basedOn w:val="VerbatimChar"/>
+    <w:rPr>
+      <w:b/>
+      <w:color w:val="008000"/>
+    </w:rPr>
+  </w:style>
+  <w:style w:customStyle="1" w:styleId="CommentTok" w:type="character">
+    <w:name w:val="CommentTok"/>
+    <w:basedOn w:val="VerbatimChar"/>
+    <w:rPr>
+      <w:i/>
+      <w:color w:val="60a0b0"/>
+    </w:rPr>
+  </w:style>
+  <w:style w:customStyle="1" w:styleId="DocumentationTok" w:type="character">
+    <w:name w:val="DocumentationTok"/>
+    <w:basedOn w:val="VerbatimChar"/>
+    <w:rPr>
+      <w:i/>
+      <w:color w:val="ba2121"/>
+    </w:rPr>
+  </w:style>
+  <w:style w:customStyle="1" w:styleId="AnnotationTok" w:type="character">
+    <w:name w:val="AnnotationTok"/>
+    <w:basedOn w:val="VerbatimChar"/>
+    <w:rPr>
+      <w:b/>
+      <w:i/>
+      <w:color w:val="60a0b0"/>
+    </w:rPr>
+  </w:style>
+  <w:style w:customStyle="1" w:styleId="CommentVarTok" w:type="character">
+    <w:name w:val="CommentVarTok"/>
+    <w:basedOn w:val="VerbatimChar"/>
+    <w:rPr>
+      <w:b/>
+      <w:i/>
+      <w:color w:val="60a0b0"/>
+    </w:rPr>
+  </w:style>
+  <w:style w:customStyle="1" w:styleId="OtherTok" w:type="character">
+    <w:name w:val="OtherTok"/>
+    <w:basedOn w:val="VerbatimChar"/>
+    <w:rPr>
+      <w:color w:val="007020"/>
+    </w:rPr>
+  </w:style>
+  <w:style w:customStyle="1" w:styleId="FunctionTok" w:type="character">
+    <w:name w:val="FunctionTok"/>
+    <w:basedOn w:val="VerbatimChar"/>
+    <w:rPr>
+      <w:color w:val="06287e"/>
+    </w:rPr>
+  </w:style>
+  <w:style w:customStyle="1" w:styleId="VariableTok" w:type="character">
+    <w:name w:val="VariableTok"/>
+    <w:basedOn w:val="VerbatimChar"/>
+    <w:rPr>
+      <w:color w:val="19177c"/>
+    </w:rPr>
+  </w:style>
+  <w:style w:customStyle="1" w:styleId="ControlFlowTok" w:type="character">
+    <w:name w:val="ControlFlowTok"/>
+    <w:basedOn w:val="VerbatimChar"/>
+    <w:rPr>
+      <w:b/>
+      <w:color w:val="007020"/>
+    </w:rPr>
+  </w:style>
+  <w:style w:customStyle="1" w:styleId="OperatorTok" w:type="character">
+    <w:name w:val="OperatorTok"/>
+    <w:basedOn w:val="VerbatimChar"/>
+    <w:rPr>
+      <w:color w:val="666666"/>
+    </w:rPr>
+  </w:style>
+  <w:style w:customStyle="1" w:styleId="BuiltInTok" w:type="character">
+    <w:name w:val="BuiltInTok"/>
+    <w:basedOn w:val="VerbatimChar"/>
+    <w:rPr>
+      <w:color w:val="008000"/>
+    </w:rPr>
+  </w:style>
+  <w:style w:customStyle="1" w:styleId="ExtensionTok" w:type="character">
+    <w:name w:val="ExtensionTok"/>
+    <w:basedOn w:val="VerbatimChar"/>
+    <w:rPr/>
+  </w:style>
+  <w:style w:customStyle="1" w:styleId="PreprocessorTok" w:type="character">
+    <w:name w:val="PreprocessorTok"/>
+    <w:basedOn w:val="VerbatimChar"/>
+    <w:rPr>
+      <w:color w:val="bc7a00"/>
+    </w:rPr>
+  </w:style>
+  <w:style w:customStyle="1" w:styleId="AttributeTok" w:type="character">
+    <w:name w:val="AttributeTok"/>
+    <w:basedOn w:val="VerbatimChar"/>
+    <w:rPr>
+      <w:color w:val="7d9029"/>
+    </w:rPr>
+  </w:style>
+  <w:style w:customStyle="1" w:styleId="RegionMarkerTok" w:type="character">
+    <w:name w:val="RegionMarkerTok"/>
+    <w:basedOn w:val="VerbatimChar"/>
+    <w:rPr/>
+  </w:style>
+  <w:style w:customStyle="1" w:styleId="InformationTok" w:type="character">
+    <w:name w:val="InformationTok"/>
+    <w:basedOn w:val="VerbatimChar"/>
+    <w:rPr>
+      <w:b/>
+      <w:i/>
+      <w:color w:val="60a0b0"/>
+    </w:rPr>
+  </w:style>
+  <w:style w:customStyle="1" w:styleId="WarningTok" w:type="character">
+    <w:name w:val="WarningTok"/>
+    <w:basedOn w:val="VerbatimChar"/>
+    <w:rPr>
+      <w:b/>
+      <w:i/>
+      <w:color w:val="60a0b0"/>
+    </w:rPr>
+  </w:style>
+  <w:style w:customStyle="1" w:styleId="AlertTok" w:type="character">
+    <w:name w:val="AlertTok"/>
+    <w:basedOn w:val="VerbatimChar"/>
+    <w:rPr>
+      <w:b/>
+      <w:color w:val="ff0000"/>
+    </w:rPr>
+  </w:style>
+  <w:style w:customStyle="1" w:styleId="ErrorTok" w:type="character">
+    <w:name w:val="ErrorTok"/>
+    <w:basedOn w:val="VerbatimChar"/>
+    <w:rPr>
+      <w:b/>
+      <w:color w:val="ff0000"/>
+    </w:rPr>
+  </w:style>
+  <w:style w:customStyle="1" w:styleId="NormalTok" w:type="character">
+    <w:name w:val="NormalTok"/>
+    <w:basedOn w:val="VerbatimChar"/>
+    <w:rPr/>
   </w:style>
   <w:style w:customStyle="1" w:styleId="KeywordTok" w:type="character">
     <w:name w:val="KeywordTok"/>

</xml_diff>

<commit_message>
Add targeted V&V and uncertainty clarity to final report draft
</commit_message>
<xml_diff>
--- a/reports/final/source/UCL-HTGR-Group3-Report-DRAFT_revised.docx
+++ b/reports/final/source/UCL-HTGR-Group3-Report-DRAFT_revised.docx
@@ -1817,6 +1817,62 @@
         <w:t xml:space="preserve">FoMs, not audited inventory claims.</w:t>
       </w:r>
     </w:p>
+    <w:p>
+      <w:pPr>
+        <w:pStyle w:val="FirstParagraph"/>
+      </w:pPr>
+      <w:r>
+        <w:t xml:space="preserve">This headline boundary was selected because the project objective is an</w:t>
+      </w:r>
+      <w:r>
+        <w:t xml:space="preserve"> </w:t>
+      </w:r>
+      <w:r>
+        <w:t xml:space="preserve">integrated fuel-factory concept, not a DAC-only operational metric. The</w:t>
+      </w:r>
+      <w:r>
+        <w:t xml:space="preserve"> </w:t>
+      </w:r>
+      <w:r>
+        <w:rPr>
+          <w:rStyle w:val="VerbatimChar"/>
+        </w:rPr>
+        <w:t xml:space="preserve">fuel_displacement</w:t>
+      </w:r>
+      <w:r>
+        <w:t xml:space="preserve"> </w:t>
+      </w:r>
+      <w:r>
+        <w:t xml:space="preserve">basis therefore quantifies avoided fossil-service</w:t>
+      </w:r>
+      <w:r>
+        <w:t xml:space="preserve"> </w:t>
+      </w:r>
+      <w:r>
+        <w:t xml:space="preserve">impact for produced methanol, while</w:t>
+      </w:r>
+      <w:r>
+        <w:t xml:space="preserve"> </w:t>
+      </w:r>
+      <w:r>
+        <w:rPr>
+          <w:rStyle w:val="VerbatimChar"/>
+        </w:rPr>
+        <w:t xml:space="preserve">operational_only</w:t>
+      </w:r>
+      <w:r>
+        <w:t xml:space="preserve"> </w:t>
+      </w:r>
+      <w:r>
+        <w:t xml:space="preserve">is retained to</w:t>
+      </w:r>
+      <w:r>
+        <w:t xml:space="preserve"> </w:t>
+      </w:r>
+      <w:r>
+        <w:t xml:space="preserve">show sensitivity to accounting boundary choice.</w:t>
+      </w:r>
+    </w:p>
     <w:bookmarkEnd w:id="63"/>
     <w:bookmarkEnd w:id="64"/>
     <w:bookmarkEnd w:id="65"/>
@@ -2069,6 +2125,458 @@
         <w:t xml:space="preserve">Section 6.</w:t>
       </w:r>
     </w:p>
+    <w:p>
+      <w:pPr>
+        <w:pStyle w:val="BodyText"/>
+      </w:pPr>
+      <w:r>
+        <w:t xml:space="preserve">Table 5.1 — Compact V&amp;V Evidence Summary</w:t>
+      </w:r>
+    </w:p>
+    <w:tbl>
+      <w:tblPr>
+        <w:tblStyle w:val="Table"/>
+        <w:tblW w:type="auto" w:w="0"/>
+        <w:tblLook w:firstRow="1" w:lastRow="0" w:firstColumn="0" w:lastColumn="0" w:noHBand="0" w:noVBand="0" w:val="0020"/>
+      </w:tblPr>
+      <w:tblGrid>
+        <w:gridCol w:w="1584"/>
+        <w:gridCol w:w="1584"/>
+        <w:gridCol w:w="1584"/>
+        <w:gridCol w:w="1584"/>
+        <w:gridCol w:w="1584"/>
+      </w:tblGrid>
+      <w:tr>
+        <w:trPr>
+          <w:tblHeader w:val="on"/>
+        </w:trPr>
+        <w:tc>
+          <w:tcPr/>
+          <w:p>
+            <w:pPr>
+              <w:pStyle w:val="Compact"/>
+            </w:pPr>
+            <w:r>
+              <w:t xml:space="preserve">Check</w:t>
+            </w:r>
+          </w:p>
+        </w:tc>
+        <w:tc>
+          <w:tcPr/>
+          <w:p>
+            <w:pPr>
+              <w:pStyle w:val="Compact"/>
+              <w:jc w:val="right"/>
+            </w:pPr>
+            <w:r>
+              <w:t xml:space="preserve">Model value</w:t>
+            </w:r>
+          </w:p>
+        </w:tc>
+        <w:tc>
+          <w:tcPr/>
+          <w:p>
+            <w:pPr>
+              <w:pStyle w:val="Compact"/>
+            </w:pPr>
+            <w:r>
+              <w:t xml:space="preserve">Acceptance basis</w:t>
+            </w:r>
+          </w:p>
+        </w:tc>
+        <w:tc>
+          <w:tcPr/>
+          <w:p>
+            <w:pPr>
+              <w:pStyle w:val="Compact"/>
+            </w:pPr>
+            <w:r>
+              <w:t xml:space="preserve">Result</w:t>
+            </w:r>
+          </w:p>
+        </w:tc>
+        <w:tc>
+          <w:tcPr/>
+          <w:p>
+            <w:pPr>
+              <w:pStyle w:val="Compact"/>
+            </w:pPr>
+            <w:r>
+              <w:t xml:space="preserve">Source artifact</w:t>
+            </w:r>
+          </w:p>
+        </w:tc>
+      </w:tr>
+      <w:tr>
+        <w:tc>
+          <w:tcPr/>
+          <w:p>
+            <w:pPr>
+              <w:pStyle w:val="Compact"/>
+            </w:pPr>
+            <w:r>
+              <w:t xml:space="preserve">Dostal thermal efficiency</w:t>
+            </w:r>
+          </w:p>
+        </w:tc>
+        <w:tc>
+          <w:tcPr/>
+          <w:p>
+            <w:pPr>
+              <w:pStyle w:val="Compact"/>
+              <w:jc w:val="right"/>
+            </w:pPr>
+            <w:r>
+              <w:t xml:space="preserve">41.10%</w:t>
+            </w:r>
+          </w:p>
+        </w:tc>
+        <w:tc>
+          <w:tcPr/>
+          <w:p>
+            <w:pPr>
+              <w:pStyle w:val="Compact"/>
+            </w:pPr>
+            <w:r>
+              <w:t xml:space="preserve">45.0% +/- 5.0%</w:t>
+            </w:r>
+          </w:p>
+        </w:tc>
+        <w:tc>
+          <w:tcPr/>
+          <w:p>
+            <w:pPr>
+              <w:pStyle w:val="Compact"/>
+            </w:pPr>
+            <w:r>
+              <w:t xml:space="preserve">Pass</w:t>
+            </w:r>
+          </w:p>
+        </w:tc>
+        <w:tc>
+          <w:tcPr/>
+          <w:p>
+            <w:pPr>
+              <w:pStyle w:val="Compact"/>
+            </w:pPr>
+            <w:r>
+              <w:rPr>
+                <w:rStyle w:val="VerbatimChar"/>
+              </w:rPr>
+              <w:t xml:space="preserve">run_tests.py</w:t>
+            </w:r>
+            <w:r>
+              <w:t xml:space="preserve"> </w:t>
+            </w:r>
+            <w:r>
+              <w:t xml:space="preserve">Test 1 output</w:t>
+            </w:r>
+          </w:p>
+        </w:tc>
+      </w:tr>
+      <w:tr>
+        <w:tc>
+          <w:tcPr/>
+          <w:p>
+            <w:pPr>
+              <w:pStyle w:val="Compact"/>
+            </w:pPr>
+            <w:r>
+              <w:t xml:space="preserve">Headline plant closure</w:t>
+            </w:r>
+          </w:p>
+        </w:tc>
+        <w:tc>
+          <w:tcPr/>
+          <w:p>
+            <w:pPr>
+              <w:pStyle w:val="Compact"/>
+              <w:jc w:val="right"/>
+            </w:pPr>
+            <w:r>
+              <w:t xml:space="preserve">0.377%</w:t>
+            </w:r>
+          </w:p>
+        </w:tc>
+        <w:tc>
+          <w:tcPr/>
+          <w:p>
+            <w:pPr>
+              <w:pStyle w:val="Compact"/>
+            </w:pPr>
+            <w:r>
+              <w:t xml:space="preserve">&lt;= 0.5%</w:t>
+            </w:r>
+          </w:p>
+        </w:tc>
+        <w:tc>
+          <w:tcPr/>
+          <w:p>
+            <w:pPr>
+              <w:pStyle w:val="Compact"/>
+            </w:pPr>
+            <w:r>
+              <w:t xml:space="preserve">Pass</w:t>
+            </w:r>
+          </w:p>
+        </w:tc>
+        <w:tc>
+          <w:tcPr/>
+          <w:p>
+            <w:pPr>
+              <w:pStyle w:val="Compact"/>
+            </w:pPr>
+            <w:r>
+              <w:rPr>
+                <w:rStyle w:val="VerbatimChar"/>
+              </w:rPr>
+              <w:t xml:space="preserve">S2_30MW_FUELDISP.json</w:t>
+            </w:r>
+          </w:p>
+        </w:tc>
+      </w:tr>
+      <w:tr>
+        <w:tc>
+          <w:tcPr/>
+          <w:p>
+            <w:pPr>
+              <w:pStyle w:val="Compact"/>
+            </w:pPr>
+            <w:r>
+              <w:t xml:space="preserve">Headline feasibility</w:t>
+            </w:r>
+          </w:p>
+        </w:tc>
+        <w:tc>
+          <w:tcPr/>
+          <w:p>
+            <w:pPr>
+              <w:pStyle w:val="Compact"/>
+              <w:jc w:val="right"/>
+            </w:pPr>
+            <w:r>
+              <w:t xml:space="preserve">Converged=True, Feasible=True</w:t>
+            </w:r>
+          </w:p>
+        </w:tc>
+        <w:tc>
+          <w:tcPr/>
+          <w:p>
+            <w:pPr>
+              <w:pStyle w:val="Compact"/>
+            </w:pPr>
+            <w:r>
+              <w:t xml:space="preserve">Both must be true</w:t>
+            </w:r>
+          </w:p>
+        </w:tc>
+        <w:tc>
+          <w:tcPr/>
+          <w:p>
+            <w:pPr>
+              <w:pStyle w:val="Compact"/>
+            </w:pPr>
+            <w:r>
+              <w:t xml:space="preserve">Pass</w:t>
+            </w:r>
+          </w:p>
+        </w:tc>
+        <w:tc>
+          <w:tcPr/>
+          <w:p>
+            <w:pPr>
+              <w:pStyle w:val="Compact"/>
+            </w:pPr>
+            <w:r>
+              <w:rPr>
+                <w:rStyle w:val="VerbatimChar"/>
+              </w:rPr>
+              <w:t xml:space="preserve">S2_30MW_FUELDISP.json</w:t>
+            </w:r>
+          </w:p>
+        </w:tc>
+      </w:tr>
+      <w:tr>
+        <w:tc>
+          <w:tcPr/>
+          <w:p>
+            <w:pPr>
+              <w:pStyle w:val="Compact"/>
+            </w:pPr>
+            <w:r>
+              <w:t xml:space="preserve">Objective consistency gap</w:t>
+            </w:r>
+          </w:p>
+        </w:tc>
+        <w:tc>
+          <w:tcPr/>
+          <w:p>
+            <w:pPr>
+              <w:pStyle w:val="Compact"/>
+              <w:jc w:val="right"/>
+            </w:pPr>
+            <w:r>
+              <w:t xml:space="preserve">0.0 relative</w:t>
+            </w:r>
+          </w:p>
+        </w:tc>
+        <w:tc>
+          <w:tcPr/>
+          <w:p>
+            <w:pPr>
+              <w:pStyle w:val="Compact"/>
+            </w:pPr>
+            <w:r>
+              <w:t xml:space="preserve">&lt;= 0.01</w:t>
+            </w:r>
+          </w:p>
+        </w:tc>
+        <w:tc>
+          <w:tcPr/>
+          <w:p>
+            <w:pPr>
+              <w:pStyle w:val="Compact"/>
+            </w:pPr>
+            <w:r>
+              <w:t xml:space="preserve">Pass</w:t>
+            </w:r>
+          </w:p>
+        </w:tc>
+        <w:tc>
+          <w:tcPr/>
+          <w:p>
+            <w:pPr>
+              <w:pStyle w:val="Compact"/>
+            </w:pPr>
+            <w:r>
+              <w:rPr>
+                <w:rStyle w:val="VerbatimChar"/>
+              </w:rPr>
+              <w:t xml:space="preserve">S2_30MW_FUELDISP.json</w:t>
+            </w:r>
+          </w:p>
+        </w:tc>
+      </w:tr>
+      <w:tr>
+        <w:tc>
+          <w:tcPr/>
+          <w:p>
+            <w:pPr>
+              <w:pStyle w:val="Compact"/>
+            </w:pPr>
+            <w:r>
+              <w:t xml:space="preserve">Methanol floor policy</w:t>
+            </w:r>
+          </w:p>
+        </w:tc>
+        <w:tc>
+          <w:tcPr/>
+          <w:p>
+            <w:pPr>
+              <w:pStyle w:val="Compact"/>
+              <w:jc w:val="right"/>
+            </w:pPr>
+            <w:r>
+              <w:t xml:space="preserve">9955.4 &gt;= 8833.0 t/yr</w:t>
+            </w:r>
+          </w:p>
+        </w:tc>
+        <w:tc>
+          <w:tcPr/>
+          <w:p>
+            <w:pPr>
+              <w:pStyle w:val="Compact"/>
+            </w:pPr>
+            <w:r>
+              <w:t xml:space="preserve">Must satisfy floor</w:t>
+            </w:r>
+          </w:p>
+        </w:tc>
+        <w:tc>
+          <w:tcPr/>
+          <w:p>
+            <w:pPr>
+              <w:pStyle w:val="Compact"/>
+            </w:pPr>
+            <w:r>
+              <w:t xml:space="preserve">Pass</w:t>
+            </w:r>
+          </w:p>
+        </w:tc>
+        <w:tc>
+          <w:tcPr/>
+          <w:p>
+            <w:pPr>
+              <w:pStyle w:val="Compact"/>
+            </w:pPr>
+            <w:r>
+              <w:rPr>
+                <w:rStyle w:val="VerbatimChar"/>
+              </w:rPr>
+              <w:t xml:space="preserve">S2_30MW_FUELDISP.json</w:t>
+            </w:r>
+          </w:p>
+        </w:tc>
+      </w:tr>
+      <w:tr>
+        <w:tc>
+          <w:tcPr/>
+          <w:p>
+            <w:pPr>
+              <w:pStyle w:val="Compact"/>
+            </w:pPr>
+            <w:r>
+              <w:t xml:space="preserve">Accounting-mode consistency</w:t>
+            </w:r>
+          </w:p>
+        </w:tc>
+        <w:tc>
+          <w:tcPr/>
+          <w:p>
+            <w:pPr>
+              <w:pStyle w:val="Compact"/>
+              <w:jc w:val="right"/>
+            </w:pPr>
+            <w:r>
+              <w:t xml:space="preserve">Tagged + conversion checks pass</w:t>
+            </w:r>
+          </w:p>
+        </w:tc>
+        <w:tc>
+          <w:tcPr/>
+          <w:p>
+            <w:pPr>
+              <w:pStyle w:val="Compact"/>
+            </w:pPr>
+            <w:r>
+              <w:t xml:space="preserve">No boundary mismatch</w:t>
+            </w:r>
+          </w:p>
+        </w:tc>
+        <w:tc>
+          <w:tcPr/>
+          <w:p>
+            <w:pPr>
+              <w:pStyle w:val="Compact"/>
+            </w:pPr>
+            <w:r>
+              <w:t xml:space="preserve">Pass</w:t>
+            </w:r>
+          </w:p>
+        </w:tc>
+        <w:tc>
+          <w:tcPr/>
+          <w:p>
+            <w:pPr>
+              <w:pStyle w:val="Compact"/>
+            </w:pPr>
+            <w:r>
+              <w:t xml:space="preserve">canonical pack metadata</w:t>
+            </w:r>
+          </w:p>
+        </w:tc>
+      </w:tr>
+    </w:tbl>
     <w:bookmarkEnd w:id="68"/>
     <w:bookmarkEnd w:id="69"/>
     <w:bookmarkStart w:id="73" w:name="section-6---results--figures-of-merit"/>
@@ -2775,6 +3283,38 @@
       </w:r>
       <w:r>
         <w:t xml:space="preserve">/ 1220.1, and a 95% interval of 690.2 to 1238.5 tCO2/MWth/year.</w:t>
+      </w:r>
+    </w:p>
+    <w:p>
+      <w:pPr>
+        <w:pStyle w:val="BodyText"/>
+      </w:pPr>
+      <w:r>
+        <w:t xml:space="preserve">Interpreted for decision-making, these bounds indicate the headline case</w:t>
+      </w:r>
+      <w:r>
+        <w:t xml:space="preserve"> </w:t>
+      </w:r>
+      <w:r>
+        <w:t xml:space="preserve">remains net-positive across sampled parameter uncertainty while showing</w:t>
+      </w:r>
+      <w:r>
+        <w:t xml:space="preserve"> </w:t>
+      </w:r>
+      <w:r>
+        <w:t xml:space="preserve">material spread in magnitude. The uncertainty interval is therefore used</w:t>
+      </w:r>
+      <w:r>
+        <w:t xml:space="preserve"> </w:t>
+      </w:r>
+      <w:r>
+        <w:t xml:space="preserve">to communicate confidence and range, not to replace the single locked</w:t>
+      </w:r>
+      <w:r>
+        <w:t xml:space="preserve"> </w:t>
+      </w:r>
+      <w:r>
+        <w:t xml:space="preserve">headline FoM value.</w:t>
       </w:r>
     </w:p>
     <w:bookmarkEnd w:id="71"/>
@@ -6520,6 +7060,232 @@
     <w:pPr>
       <w:wordWrap w:val="off"/>
     </w:pPr>
+  </w:style>
+  <w:style w:customStyle="1" w:styleId="KeywordTok" w:type="character">
+    <w:name w:val="KeywordTok"/>
+    <w:basedOn w:val="VerbatimChar"/>
+    <w:rPr>
+      <w:b/>
+      <w:color w:val="007020"/>
+    </w:rPr>
+  </w:style>
+  <w:style w:customStyle="1" w:styleId="DataTypeTok" w:type="character">
+    <w:name w:val="DataTypeTok"/>
+    <w:basedOn w:val="VerbatimChar"/>
+    <w:rPr>
+      <w:color w:val="902000"/>
+    </w:rPr>
+  </w:style>
+  <w:style w:customStyle="1" w:styleId="DecValTok" w:type="character">
+    <w:name w:val="DecValTok"/>
+    <w:basedOn w:val="VerbatimChar"/>
+    <w:rPr>
+      <w:color w:val="40a070"/>
+    </w:rPr>
+  </w:style>
+  <w:style w:customStyle="1" w:styleId="BaseNTok" w:type="character">
+    <w:name w:val="BaseNTok"/>
+    <w:basedOn w:val="VerbatimChar"/>
+    <w:rPr>
+      <w:color w:val="40a070"/>
+    </w:rPr>
+  </w:style>
+  <w:style w:customStyle="1" w:styleId="FloatTok" w:type="character">
+    <w:name w:val="FloatTok"/>
+    <w:basedOn w:val="VerbatimChar"/>
+    <w:rPr>
+      <w:color w:val="40a070"/>
+    </w:rPr>
+  </w:style>
+  <w:style w:customStyle="1" w:styleId="ConstantTok" w:type="character">
+    <w:name w:val="ConstantTok"/>
+    <w:basedOn w:val="VerbatimChar"/>
+    <w:rPr>
+      <w:color w:val="880000"/>
+    </w:rPr>
+  </w:style>
+  <w:style w:customStyle="1" w:styleId="CharTok" w:type="character">
+    <w:name w:val="CharTok"/>
+    <w:basedOn w:val="VerbatimChar"/>
+    <w:rPr>
+      <w:color w:val="4070a0"/>
+    </w:rPr>
+  </w:style>
+  <w:style w:customStyle="1" w:styleId="SpecialCharTok" w:type="character">
+    <w:name w:val="SpecialCharTok"/>
+    <w:basedOn w:val="VerbatimChar"/>
+    <w:rPr>
+      <w:color w:val="4070a0"/>
+    </w:rPr>
+  </w:style>
+  <w:style w:customStyle="1" w:styleId="StringTok" w:type="character">
+    <w:name w:val="StringTok"/>
+    <w:basedOn w:val="VerbatimChar"/>
+    <w:rPr>
+      <w:color w:val="4070a0"/>
+    </w:rPr>
+  </w:style>
+  <w:style w:customStyle="1" w:styleId="VerbatimStringTok" w:type="character">
+    <w:name w:val="VerbatimStringTok"/>
+    <w:basedOn w:val="VerbatimChar"/>
+    <w:rPr>
+      <w:color w:val="4070a0"/>
+    </w:rPr>
+  </w:style>
+  <w:style w:customStyle="1" w:styleId="SpecialStringTok" w:type="character">
+    <w:name w:val="SpecialStringTok"/>
+    <w:basedOn w:val="VerbatimChar"/>
+    <w:rPr>
+      <w:color w:val="bb6688"/>
+    </w:rPr>
+  </w:style>
+  <w:style w:customStyle="1" w:styleId="ImportTok" w:type="character">
+    <w:name w:val="ImportTok"/>
+    <w:basedOn w:val="VerbatimChar"/>
+    <w:rPr>
+      <w:b/>
+      <w:color w:val="008000"/>
+    </w:rPr>
+  </w:style>
+  <w:style w:customStyle="1" w:styleId="CommentTok" w:type="character">
+    <w:name w:val="CommentTok"/>
+    <w:basedOn w:val="VerbatimChar"/>
+    <w:rPr>
+      <w:i/>
+      <w:color w:val="60a0b0"/>
+    </w:rPr>
+  </w:style>
+  <w:style w:customStyle="1" w:styleId="DocumentationTok" w:type="character">
+    <w:name w:val="DocumentationTok"/>
+    <w:basedOn w:val="VerbatimChar"/>
+    <w:rPr>
+      <w:i/>
+      <w:color w:val="ba2121"/>
+    </w:rPr>
+  </w:style>
+  <w:style w:customStyle="1" w:styleId="AnnotationTok" w:type="character">
+    <w:name w:val="AnnotationTok"/>
+    <w:basedOn w:val="VerbatimChar"/>
+    <w:rPr>
+      <w:b/>
+      <w:i/>
+      <w:color w:val="60a0b0"/>
+    </w:rPr>
+  </w:style>
+  <w:style w:customStyle="1" w:styleId="CommentVarTok" w:type="character">
+    <w:name w:val="CommentVarTok"/>
+    <w:basedOn w:val="VerbatimChar"/>
+    <w:rPr>
+      <w:b/>
+      <w:i/>
+      <w:color w:val="60a0b0"/>
+    </w:rPr>
+  </w:style>
+  <w:style w:customStyle="1" w:styleId="OtherTok" w:type="character">
+    <w:name w:val="OtherTok"/>
+    <w:basedOn w:val="VerbatimChar"/>
+    <w:rPr>
+      <w:color w:val="007020"/>
+    </w:rPr>
+  </w:style>
+  <w:style w:customStyle="1" w:styleId="FunctionTok" w:type="character">
+    <w:name w:val="FunctionTok"/>
+    <w:basedOn w:val="VerbatimChar"/>
+    <w:rPr>
+      <w:color w:val="06287e"/>
+    </w:rPr>
+  </w:style>
+  <w:style w:customStyle="1" w:styleId="VariableTok" w:type="character">
+    <w:name w:val="VariableTok"/>
+    <w:basedOn w:val="VerbatimChar"/>
+    <w:rPr>
+      <w:color w:val="19177c"/>
+    </w:rPr>
+  </w:style>
+  <w:style w:customStyle="1" w:styleId="ControlFlowTok" w:type="character">
+    <w:name w:val="ControlFlowTok"/>
+    <w:basedOn w:val="VerbatimChar"/>
+    <w:rPr>
+      <w:b/>
+      <w:color w:val="007020"/>
+    </w:rPr>
+  </w:style>
+  <w:style w:customStyle="1" w:styleId="OperatorTok" w:type="character">
+    <w:name w:val="OperatorTok"/>
+    <w:basedOn w:val="VerbatimChar"/>
+    <w:rPr>
+      <w:color w:val="666666"/>
+    </w:rPr>
+  </w:style>
+  <w:style w:customStyle="1" w:styleId="BuiltInTok" w:type="character">
+    <w:name w:val="BuiltInTok"/>
+    <w:basedOn w:val="VerbatimChar"/>
+    <w:rPr>
+      <w:color w:val="008000"/>
+    </w:rPr>
+  </w:style>
+  <w:style w:customStyle="1" w:styleId="ExtensionTok" w:type="character">
+    <w:name w:val="ExtensionTok"/>
+    <w:basedOn w:val="VerbatimChar"/>
+    <w:rPr/>
+  </w:style>
+  <w:style w:customStyle="1" w:styleId="PreprocessorTok" w:type="character">
+    <w:name w:val="PreprocessorTok"/>
+    <w:basedOn w:val="VerbatimChar"/>
+    <w:rPr>
+      <w:color w:val="bc7a00"/>
+    </w:rPr>
+  </w:style>
+  <w:style w:customStyle="1" w:styleId="AttributeTok" w:type="character">
+    <w:name w:val="AttributeTok"/>
+    <w:basedOn w:val="VerbatimChar"/>
+    <w:rPr>
+      <w:color w:val="7d9029"/>
+    </w:rPr>
+  </w:style>
+  <w:style w:customStyle="1" w:styleId="RegionMarkerTok" w:type="character">
+    <w:name w:val="RegionMarkerTok"/>
+    <w:basedOn w:val="VerbatimChar"/>
+    <w:rPr/>
+  </w:style>
+  <w:style w:customStyle="1" w:styleId="InformationTok" w:type="character">
+    <w:name w:val="InformationTok"/>
+    <w:basedOn w:val="VerbatimChar"/>
+    <w:rPr>
+      <w:b/>
+      <w:i/>
+      <w:color w:val="60a0b0"/>
+    </w:rPr>
+  </w:style>
+  <w:style w:customStyle="1" w:styleId="WarningTok" w:type="character">
+    <w:name w:val="WarningTok"/>
+    <w:basedOn w:val="VerbatimChar"/>
+    <w:rPr>
+      <w:b/>
+      <w:i/>
+      <w:color w:val="60a0b0"/>
+    </w:rPr>
+  </w:style>
+  <w:style w:customStyle="1" w:styleId="AlertTok" w:type="character">
+    <w:name w:val="AlertTok"/>
+    <w:basedOn w:val="VerbatimChar"/>
+    <w:rPr>
+      <w:b/>
+      <w:color w:val="ff0000"/>
+    </w:rPr>
+  </w:style>
+  <w:style w:customStyle="1" w:styleId="ErrorTok" w:type="character">
+    <w:name w:val="ErrorTok"/>
+    <w:basedOn w:val="VerbatimChar"/>
+    <w:rPr>
+      <w:b/>
+      <w:color w:val="ff0000"/>
+    </w:rPr>
+  </w:style>
+  <w:style w:customStyle="1" w:styleId="NormalTok" w:type="character">
+    <w:name w:val="NormalTok"/>
+    <w:basedOn w:val="VerbatimChar"/>
+    <w:rPr/>
   </w:style>
   <w:style w:customStyle="1" w:styleId="KeywordTok" w:type="character">
     <w:name w:val="KeywordTok"/>

</xml_diff>